<commit_message>
tc mefa imp topic added
</commit_message>
<xml_diff>
--- a/public/assets/more/CSE/RTU Imp topic for 4th Semester.docx
+++ b/public/assets/more/CSE/RTU Imp topic for 4th Semester.docx
@@ -830,6 +830,7 @@
         <w:jc w:val="left"/>
         <w:rPr>
           <w:rFonts w:hint="default" w:ascii="Consolas" w:hAnsi="Consolas" w:eastAsia="Consolas"/>
+          <w:b/>
           <w:color w:val="000000"/>
           <w:sz w:val="22"/>
           <w:szCs w:val="24"/>
@@ -856,6 +857,437 @@
       </w:r>
     </w:p>
     <w:p>
+      <w:pPr>
+        <w:spacing w:beforeLines="0" w:afterLines="0"/>
+        <w:jc w:val="left"/>
+        <w:rPr>
+          <w:rFonts w:hint="default" w:ascii="Consolas" w:hAnsi="Consolas" w:eastAsia="Consolas"/>
+          <w:b/>
+          <w:color w:val="000000"/>
+          <w:sz w:val="22"/>
+          <w:szCs w:val="24"/>
+        </w:rPr>
+      </w:pPr>
+    </w:p>
+    <w:p>
+      <w:pPr>
+        <w:spacing w:beforeLines="0" w:afterLines="0"/>
+        <w:jc w:val="left"/>
+        <w:rPr>
+          <w:rFonts w:hint="default" w:ascii="Consolas" w:hAnsi="Consolas" w:eastAsia="Consolas"/>
+          <w:b/>
+          <w:color w:val="000000"/>
+          <w:sz w:val="22"/>
+          <w:szCs w:val="24"/>
+        </w:rPr>
+      </w:pPr>
+      <w:r>
+        <w:drawing>
+          <wp:inline distT="0" distB="0" distL="114300" distR="114300">
+            <wp:extent cx="6183630" cy="2084070"/>
+            <wp:effectExtent l="0" t="0" r="7620" b="11430"/>
+            <wp:docPr id="2" name="Picture 2"/>
+            <wp:cNvGraphicFramePr>
+              <a:graphicFrameLocks xmlns:a="http://schemas.openxmlformats.org/drawingml/2006/main" noChangeAspect="1"/>
+            </wp:cNvGraphicFramePr>
+            <a:graphic xmlns:a="http://schemas.openxmlformats.org/drawingml/2006/main">
+              <a:graphicData uri="http://schemas.openxmlformats.org/drawingml/2006/picture">
+                <pic:pic xmlns:pic="http://schemas.openxmlformats.org/drawingml/2006/picture">
+                  <pic:nvPicPr>
+                    <pic:cNvPr id="2" name="Picture 2"/>
+                    <pic:cNvPicPr>
+                      <a:picLocks noChangeAspect="1"/>
+                    </pic:cNvPicPr>
+                  </pic:nvPicPr>
+                  <pic:blipFill>
+                    <a:blip r:embed="rId4"/>
+                    <a:srcRect l="36140" t="42292" r="30257" b="37544"/>
+                    <a:stretch>
+                      <a:fillRect/>
+                    </a:stretch>
+                  </pic:blipFill>
+                  <pic:spPr>
+                    <a:xfrm>
+                      <a:off x="0" y="0"/>
+                      <a:ext cx="6183630" cy="2084070"/>
+                    </a:xfrm>
+                    <a:prstGeom prst="rect">
+                      <a:avLst/>
+                    </a:prstGeom>
+                    <a:noFill/>
+                    <a:ln>
+                      <a:noFill/>
+                    </a:ln>
+                  </pic:spPr>
+                </pic:pic>
+              </a:graphicData>
+            </a:graphic>
+          </wp:inline>
+        </w:drawing>
+      </w:r>
+    </w:p>
+    <w:p>
+      <w:pPr>
+        <w:spacing w:beforeLines="0" w:afterLines="0"/>
+        <w:jc w:val="left"/>
+        <w:rPr>
+          <w:rFonts w:hint="default" w:ascii="Consolas" w:hAnsi="Consolas" w:eastAsia="Consolas"/>
+          <w:color w:val="000000"/>
+          <w:sz w:val="22"/>
+          <w:szCs w:val="24"/>
+        </w:rPr>
+      </w:pPr>
+    </w:p>
+    <w:p>
+      <w:pPr>
+        <w:spacing w:beforeLines="0" w:afterLines="0"/>
+        <w:jc w:val="left"/>
+        <w:rPr>
+          <w:rFonts w:hint="default" w:ascii="Consolas" w:hAnsi="Consolas" w:eastAsia="Consolas"/>
+          <w:b/>
+          <w:bCs w:val="0"/>
+          <w:color w:val="000000"/>
+          <w:sz w:val="44"/>
+          <w:szCs w:val="48"/>
+          <w:u w:val="single"/>
+        </w:rPr>
+      </w:pPr>
+      <w:r>
+        <w:rPr>
+          <w:rFonts w:hint="default" w:ascii="Consolas" w:hAnsi="Consolas" w:eastAsia="Consolas"/>
+          <w:b/>
+          <w:bCs w:val="0"/>
+          <w:color w:val="000000"/>
+          <w:sz w:val="44"/>
+          <w:szCs w:val="48"/>
+          <w:u w:val="single"/>
+          <w:lang w:val="en-US"/>
+        </w:rPr>
+        <w:t>TC</w:t>
+      </w:r>
+      <w:r>
+        <w:rPr>
+          <w:rFonts w:hint="default" w:ascii="Consolas" w:hAnsi="Consolas" w:eastAsia="Consolas"/>
+          <w:b/>
+          <w:bCs w:val="0"/>
+          <w:color w:val="000000"/>
+          <w:sz w:val="44"/>
+          <w:szCs w:val="48"/>
+          <w:u w:val="none"/>
+        </w:rPr>
+        <w:t>:-</w:t>
+      </w:r>
+    </w:p>
+    <w:p>
+      <w:pPr>
+        <w:rPr>
+          <w:rFonts w:hint="default" w:ascii="Consolas" w:hAnsi="Consolas" w:eastAsia="Consolas"/>
+          <w:color w:val="000000"/>
+          <w:sz w:val="22"/>
+          <w:szCs w:val="24"/>
+          <w:lang w:val="en-US"/>
+        </w:rPr>
+      </w:pPr>
+      <w:r>
+        <w:rPr>
+          <w:rFonts w:hint="default" w:ascii="Consolas" w:hAnsi="Consolas" w:eastAsia="Consolas"/>
+          <w:b/>
+          <w:color w:val="000000"/>
+          <w:sz w:val="22"/>
+          <w:szCs w:val="24"/>
+        </w:rPr>
+        <w:t>unit 1</w:t>
+      </w:r>
+      <w:r>
+        <w:rPr>
+          <w:rFonts w:hint="default" w:ascii="Consolas" w:hAnsi="Consolas" w:eastAsia="Consolas"/>
+          <w:b/>
+          <w:color w:val="000000"/>
+          <w:sz w:val="22"/>
+          <w:szCs w:val="24"/>
+          <w:lang w:val="en-US"/>
+        </w:rPr>
+        <w:t xml:space="preserve"> (Imp for 2 marks)</w:t>
+      </w:r>
+      <w:r>
+        <w:rPr>
+          <w:rFonts w:hint="default" w:ascii="Consolas" w:hAnsi="Consolas" w:eastAsia="Consolas"/>
+          <w:color w:val="000000"/>
+          <w:sz w:val="22"/>
+          <w:szCs w:val="24"/>
+        </w:rPr>
+        <w:t xml:space="preserve"> </w:t>
+      </w:r>
+      <w:r>
+        <w:rPr>
+          <w:rFonts w:hint="default" w:ascii="Consolas" w:hAnsi="Consolas" w:eastAsia="Consolas"/>
+          <w:color w:val="000000"/>
+          <w:sz w:val="22"/>
+          <w:szCs w:val="24"/>
+          <w:lang w:val="en-US"/>
+        </w:rPr>
+        <w:t xml:space="preserve">Definition and Importance, Process of TC, Aspects(Competence) of TC, Linguistic Intelligence and Haward Gardners theory, LSRW Skills, forms of TC, </w:t>
+      </w:r>
+      <w:r>
+        <w:rPr>
+          <w:rFonts w:hint="default" w:ascii="Consolas" w:hAnsi="Consolas" w:eastAsia="Consolas"/>
+          <w:b/>
+          <w:color w:val="000000"/>
+          <w:sz w:val="22"/>
+          <w:szCs w:val="24"/>
+          <w:lang w:val="en-US"/>
+        </w:rPr>
+        <w:t xml:space="preserve"> Styles and Features of TC ,</w:t>
+      </w:r>
+    </w:p>
+    <w:p>
+      <w:pPr>
+        <w:rPr>
+          <w:rFonts w:hint="default" w:ascii="Consolas" w:hAnsi="Consolas" w:eastAsia="Consolas"/>
+          <w:color w:val="000000"/>
+          <w:sz w:val="22"/>
+          <w:szCs w:val="24"/>
+          <w:lang w:val="en-US"/>
+        </w:rPr>
+      </w:pPr>
+      <w:r>
+        <w:rPr>
+          <w:rFonts w:hint="default" w:ascii="Consolas" w:hAnsi="Consolas" w:eastAsia="Consolas"/>
+          <w:color w:val="000000"/>
+          <w:sz w:val="22"/>
+          <w:szCs w:val="24"/>
+          <w:lang w:val="en-US"/>
+        </w:rPr>
+        <w:t xml:space="preserve"> </w:t>
+      </w:r>
+    </w:p>
+    <w:p>
+      <w:pPr>
+        <w:rPr>
+          <w:rFonts w:hint="default"/>
+          <w:b w:val="0"/>
+          <w:bCs/>
+          <w:lang w:val="en-US"/>
+        </w:rPr>
+      </w:pPr>
+      <w:r>
+        <w:rPr>
+          <w:rFonts w:hint="default" w:ascii="Consolas" w:hAnsi="Consolas" w:eastAsia="Consolas"/>
+          <w:b/>
+          <w:color w:val="000000"/>
+          <w:sz w:val="22"/>
+          <w:szCs w:val="24"/>
+        </w:rPr>
+        <w:t xml:space="preserve">unit </w:t>
+      </w:r>
+      <w:r>
+        <w:rPr>
+          <w:rFonts w:hint="default" w:ascii="Consolas" w:hAnsi="Consolas" w:eastAsia="Consolas"/>
+          <w:b/>
+          <w:color w:val="000000"/>
+          <w:sz w:val="22"/>
+          <w:szCs w:val="24"/>
+          <w:lang w:val="en-US"/>
+        </w:rPr>
+        <w:t>2</w:t>
+      </w:r>
+      <w:r>
+        <w:rPr>
+          <w:rFonts w:hint="default" w:ascii="Consolas" w:hAnsi="Consolas" w:eastAsia="Consolas"/>
+          <w:b w:val="0"/>
+          <w:bCs/>
+          <w:color w:val="000000"/>
+          <w:sz w:val="22"/>
+          <w:szCs w:val="24"/>
+          <w:lang w:val="en-US"/>
+        </w:rPr>
+        <w:t xml:space="preserve"> technical Text types and It’s process to read and write,</w:t>
+      </w:r>
+      <w:r>
+        <w:rPr>
+          <w:rFonts w:hint="default" w:ascii="Consolas" w:hAnsi="Consolas" w:eastAsia="Consolas"/>
+          <w:b/>
+          <w:color w:val="000000"/>
+          <w:sz w:val="22"/>
+          <w:szCs w:val="24"/>
+          <w:lang w:val="en-US"/>
+        </w:rPr>
+        <w:t xml:space="preserve"> Note making and its types,guidelines for good technical writing, </w:t>
+      </w:r>
+      <w:r>
+        <w:rPr>
+          <w:rFonts w:hint="default" w:ascii="Consolas" w:hAnsi="Consolas" w:eastAsia="Consolas"/>
+          <w:b w:val="0"/>
+          <w:bCs/>
+          <w:color w:val="000000"/>
+          <w:sz w:val="22"/>
+          <w:szCs w:val="24"/>
+          <w:lang w:val="en-US"/>
+        </w:rPr>
+        <w:t>document design process and information collection ,Types of Technical documents</w:t>
+      </w:r>
+    </w:p>
+    <w:p>
+      <w:pPr>
+        <w:rPr>
+          <w:rFonts w:hint="default" w:ascii="Consolas" w:hAnsi="Consolas" w:eastAsia="Consolas"/>
+          <w:color w:val="000000"/>
+          <w:sz w:val="22"/>
+          <w:szCs w:val="24"/>
+          <w:lang w:val="en-US"/>
+        </w:rPr>
+      </w:pPr>
+    </w:p>
+    <w:p>
+      <w:pPr>
+        <w:rPr>
+          <w:rFonts w:hint="default" w:ascii="Consolas" w:hAnsi="Consolas" w:eastAsia="Consolas"/>
+          <w:b/>
+          <w:bCs/>
+          <w:color w:val="000000"/>
+          <w:sz w:val="22"/>
+          <w:szCs w:val="24"/>
+          <w:lang w:val="en-US"/>
+        </w:rPr>
+      </w:pPr>
+      <w:r>
+        <w:rPr>
+          <w:rFonts w:hint="default" w:ascii="Consolas" w:hAnsi="Consolas" w:eastAsia="Consolas"/>
+          <w:b/>
+          <w:color w:val="000000"/>
+          <w:sz w:val="22"/>
+          <w:szCs w:val="24"/>
+        </w:rPr>
+        <w:t xml:space="preserve">unit </w:t>
+      </w:r>
+      <w:r>
+        <w:rPr>
+          <w:rFonts w:hint="default" w:ascii="Consolas" w:hAnsi="Consolas" w:eastAsia="Consolas"/>
+          <w:b/>
+          <w:color w:val="000000"/>
+          <w:sz w:val="22"/>
+          <w:szCs w:val="24"/>
+          <w:lang w:val="en-US"/>
+        </w:rPr>
+        <w:t>3</w:t>
+      </w:r>
+      <w:r>
+        <w:rPr>
+          <w:rFonts w:hint="default" w:ascii="Consolas" w:hAnsi="Consolas" w:eastAsia="Consolas"/>
+          <w:color w:val="000000"/>
+          <w:sz w:val="22"/>
+          <w:szCs w:val="24"/>
+        </w:rPr>
+        <w:t xml:space="preserve"> </w:t>
+      </w:r>
+      <w:r>
+        <w:rPr>
+          <w:rFonts w:hint="default" w:ascii="Consolas" w:hAnsi="Consolas" w:eastAsia="Consolas"/>
+          <w:b/>
+          <w:bCs/>
+          <w:color w:val="000000"/>
+          <w:sz w:val="22"/>
+          <w:szCs w:val="24"/>
+          <w:lang w:val="en-US"/>
+        </w:rPr>
+        <w:t xml:space="preserve">Grammar rules question related to tense or basic grammar(4marks), Meenutes of meeting(MoM),  </w:t>
+      </w:r>
+      <w:r>
+        <w:rPr>
+          <w:rFonts w:hint="default" w:ascii="Consolas" w:hAnsi="Consolas" w:eastAsia="Consolas"/>
+          <w:b/>
+          <w:bCs/>
+          <w:color w:val="000000"/>
+          <w:sz w:val="22"/>
+          <w:szCs w:val="24"/>
+          <w:lang w:val="en-US"/>
+        </w:rPr>
+        <w:tab/>
+      </w:r>
+    </w:p>
+    <w:p>
+      <w:pPr>
+        <w:rPr>
+          <w:rFonts w:hint="default" w:ascii="Consolas" w:hAnsi="Consolas" w:eastAsia="Consolas"/>
+          <w:b/>
+          <w:bCs/>
+          <w:color w:val="000000"/>
+          <w:sz w:val="22"/>
+          <w:szCs w:val="24"/>
+          <w:lang w:val="en-US"/>
+        </w:rPr>
+      </w:pPr>
+    </w:p>
+    <w:p>
+      <w:pPr>
+        <w:rPr>
+          <w:rFonts w:hint="default"/>
+          <w:lang w:val="en-US"/>
+        </w:rPr>
+      </w:pPr>
+      <w:r>
+        <w:rPr>
+          <w:rFonts w:hint="default" w:ascii="Consolas" w:hAnsi="Consolas" w:eastAsia="Consolas"/>
+          <w:b/>
+          <w:color w:val="000000"/>
+          <w:sz w:val="22"/>
+          <w:szCs w:val="24"/>
+        </w:rPr>
+        <w:t xml:space="preserve">unit </w:t>
+      </w:r>
+      <w:r>
+        <w:rPr>
+          <w:rFonts w:hint="default" w:ascii="Consolas" w:hAnsi="Consolas" w:eastAsia="Consolas"/>
+          <w:b/>
+          <w:color w:val="000000"/>
+          <w:sz w:val="22"/>
+          <w:szCs w:val="24"/>
+          <w:lang w:val="en-US"/>
+        </w:rPr>
+        <w:t>4</w:t>
+      </w:r>
+      <w:r>
+        <w:rPr>
+          <w:rFonts w:hint="default" w:ascii="Consolas" w:hAnsi="Consolas" w:eastAsia="Consolas"/>
+          <w:color w:val="000000"/>
+          <w:sz w:val="22"/>
+          <w:szCs w:val="24"/>
+        </w:rPr>
+        <w:t xml:space="preserve"> </w:t>
+      </w:r>
+      <w:r>
+        <w:rPr>
+          <w:rFonts w:hint="default" w:ascii="Consolas" w:hAnsi="Consolas" w:eastAsia="Consolas"/>
+          <w:color w:val="000000"/>
+          <w:sz w:val="22"/>
+          <w:szCs w:val="24"/>
+          <w:lang w:val="en-US"/>
+        </w:rPr>
+        <w:t>Types of Articles And Process of Technical Purposal,</w:t>
+      </w:r>
+      <w:r>
+        <w:rPr>
+          <w:rFonts w:hint="default" w:ascii="Consolas" w:hAnsi="Consolas" w:eastAsia="Consolas"/>
+          <w:b/>
+          <w:bCs/>
+          <w:color w:val="000000"/>
+          <w:sz w:val="22"/>
+          <w:szCs w:val="24"/>
+          <w:lang w:val="en-US"/>
+        </w:rPr>
+        <w:t>Report and resume writing,</w:t>
+      </w:r>
+    </w:p>
+    <w:p>
+      <w:pPr>
+        <w:rPr>
+          <w:rFonts w:hint="default" w:ascii="Consolas" w:hAnsi="Consolas" w:eastAsia="Consolas"/>
+          <w:color w:val="000000"/>
+          <w:sz w:val="22"/>
+          <w:szCs w:val="24"/>
+          <w:lang w:val="en-US"/>
+        </w:rPr>
+      </w:pPr>
       <w:bookmarkStart w:id="0" w:name="_GoBack"/>
       <w:bookmarkEnd w:id="0"/>
     </w:p>
@@ -881,7 +1313,7 @@
     <w:pPrDefault/>
   </w:docDefaults>
   <w:latentStyles w:count="260" w:defQFormat="0" w:defUnhideWhenUsed="1" w:defSemiHidden="1" w:defUIPriority="99" w:defLockedState="0">
-    <w:lsdException w:unhideWhenUsed="0" w:uiPriority="0" w:semiHidden="0" w:name="Normal"/>
+    <w:lsdException w:qFormat="1" w:unhideWhenUsed="0" w:uiPriority="0" w:semiHidden="0" w:name="Normal"/>
     <w:lsdException w:qFormat="1" w:unhideWhenUsed="0" w:uiPriority="0" w:semiHidden="0" w:name="heading 1"/>
     <w:lsdException w:qFormat="1" w:uiPriority="0" w:name="heading 2"/>
     <w:lsdException w:qFormat="1" w:uiPriority="0" w:name="heading 3"/>
@@ -1132,12 +1564,13 @@
   </w:latentStyles>
   <w:style w:type="paragraph" w:default="1" w:styleId="1">
     <w:name w:val="Normal"/>
+    <w:qFormat/>
     <w:uiPriority w:val="0"/>
     <w:pPr>
       <w:jc w:val="both"/>
     </w:pPr>
     <w:rPr>
-      <w:rFonts w:eastAsia="SimSun"/>
+      <w:rFonts w:eastAsia="SimSun" w:asciiTheme="minorHAnsi" w:hAnsiTheme="minorHAnsi" w:cstheme="minorBidi"/>
       <w:kern w:val="2"/>
       <w:sz w:val="21"/>
     </w:rPr>

</xml_diff>